<commit_message>
Add final report deliverables
</commit_message>
<xml_diff>
--- a/docs/supervisor_checkpoints/checkpoint_06_ablation_generalization.docx
+++ b/docs/supervisor_checkpoints/checkpoint_06_ablation_generalization.docx
@@ -60,7 +60,15 @@
         <w:pStyle w:val="ListBullet"/>
       </w:pPr>
       <w:r>
-        <w:t>Planned parameter-matched U-Net capacity control.</w:t>
+        <w:t>Completed parameter-matched U-Net capacity control with base_channels=42.</w:t>
+      </w:r>
+    </w:p>
+    <w:p>
+      <w:pPr>
+        <w:pStyle w:val="ListBullet"/>
+      </w:pPr>
+      <w:r>
+        <w:t>Finalized interpretation: residual backbone is strongest on SSIM, Delta E, and entropy; parameter-matched U-Net is strongest on MSE, MAE, and PSNR.</w:t>
       </w:r>
     </w:p>
     <w:p>
@@ -77,6 +85,14 @@
       </w:pPr>
       <w:r>
         <w:t>Resolution ablation table</w:t>
+      </w:r>
+    </w:p>
+    <w:p>
+      <w:pPr>
+        <w:pStyle w:val="ListBullet"/>
+      </w:pPr>
+      <w:r>
+        <w:t>Capacity-control metric table</w:t>
       </w:r>
     </w:p>
     <w:p>
@@ -105,7 +121,7 @@
     </w:p>
     <w:p>
       <w:r>
-        <w:t>This checkpoint summarizes progress evidence. Full quantitative claims should be made only after full test-set evaluation.</w:t>
+        <w:t>This checkpoint summarizes progress evidence. Final quantitative claims are based on the fixed 368-image paired test split.</w:t>
       </w:r>
     </w:p>
     <w:p>
@@ -118,7 +134,7 @@
     </w:p>
     <w:p>
       <w:r>
-        <w:t>Freeze experiments and prepare the final report.</w:t>
+        <w:t>Submit the final report and presentation materials.</w:t>
       </w:r>
     </w:p>
     <w:sectPr>

</xml_diff>